<commit_message>
feat: add ocnfigure files for jmeter, lecture screenshots, results(csv, logs), q&a, report
</commit_message>
<xml_diff>
--- a/Lab3/lab3.docx
+++ b/Lab3/lab3.docx
@@ -1800,45 +1800,81 @@
     </w:p>
     <w:p>
       <w:pPr>
-        <w:jc w:val="center"/>
-      </w:pPr>
-      <w:r>
-        <w:rPr>
-          <w:noProof/>
-        </w:rPr>
-        <w:pict w14:anchorId="016FD74D">
-          <v:shapetype id="_x0000_t75" coordsize="21600,21600" o:spt="75" o:preferrelative="t" path="m@4@5l@4@11@9@11@9@5xe" filled="f" stroked="f">
-            <v:stroke joinstyle="miter"/>
-            <v:formulas>
-              <v:f eqn="if lineDrawn pixelLineWidth 0"/>
-              <v:f eqn="sum @0 1 0"/>
-              <v:f eqn="sum 0 0 @1"/>
-              <v:f eqn="prod @2 1 2"/>
-              <v:f eqn="prod @3 21600 pixelWidth"/>
-              <v:f eqn="prod @3 21600 pixelHeight"/>
-              <v:f eqn="sum @0 0 1"/>
-              <v:f eqn="prod @6 1 2"/>
-              <v:f eqn="prod @7 21600 pixelWidth"/>
-              <v:f eqn="sum @8 21600 0"/>
-              <v:f eqn="prod @7 21600 pixelHeight"/>
-              <v:f eqn="sum @10 21600 0"/>
-            </v:formulas>
-            <v:path o:extrusionok="f" gradientshapeok="t" o:connecttype="rect"/>
-            <o:lock v:ext="edit" aspectratio="t"/>
-          </v:shapetype>
-          <v:shape id="_x0000_i1025" type="#_x0000_t75" style="width:484pt;height:156.5pt">
-            <v:imagedata r:id="rId7" o:title="Screenshot_8"/>
-          </v:shape>
-        </w:pict>
-      </w:r>
+        <w:spacing w:after="120"/>
+        <w:rPr>
+          <w:lang w:val="ru-RU"/>
+        </w:rPr>
+      </w:pPr>
     </w:p>
     <w:p>
       <w:pPr>
-        <w:rPr>
-          <w:lang w:val="ru-RU"/>
-        </w:rPr>
-      </w:pPr>
-      <w:r>
+        <w:spacing w:after="120"/>
+        <w:rPr>
+          <w:lang w:val="ru-RU"/>
+        </w:rPr>
+      </w:pPr>
+      <w:r>
+        <w:rPr>
+          <w:noProof/>
+          <w14:ligatures w14:val="standardContextual"/>
+        </w:rPr>
+        <w:drawing>
+          <wp:inline distT="0" distB="0" distL="0" distR="0" wp14:anchorId="11ADD01C" wp14:editId="421D64DE">
+            <wp:extent cx="6152515" cy="3538855"/>
+            <wp:effectExtent l="0" t="0" r="635" b="4445"/>
+            <wp:docPr id="4" name="Picture 4"/>
+            <wp:cNvGraphicFramePr>
+              <a:graphicFrameLocks xmlns:a="http://schemas.openxmlformats.org/drawingml/2006/main" noChangeAspect="1"/>
+            </wp:cNvGraphicFramePr>
+            <a:graphic xmlns:a="http://schemas.openxmlformats.org/drawingml/2006/main">
+              <a:graphicData uri="http://schemas.openxmlformats.org/drawingml/2006/picture">
+                <pic:pic xmlns:pic="http://schemas.openxmlformats.org/drawingml/2006/picture">
+                  <pic:nvPicPr>
+                    <pic:cNvPr id="1" name=""/>
+                    <pic:cNvPicPr/>
+                  </pic:nvPicPr>
+                  <pic:blipFill>
+                    <a:blip r:embed="rId7"/>
+                    <a:stretch>
+                      <a:fillRect/>
+                    </a:stretch>
+                  </pic:blipFill>
+                  <pic:spPr>
+                    <a:xfrm>
+                      <a:off x="0" y="0"/>
+                      <a:ext cx="6152515" cy="3538855"/>
+                    </a:xfrm>
+                    <a:prstGeom prst="rect">
+                      <a:avLst/>
+                    </a:prstGeom>
+                  </pic:spPr>
+                </pic:pic>
+              </a:graphicData>
+            </a:graphic>
+          </wp:inline>
+        </w:drawing>
+      </w:r>
+      <w:bookmarkStart w:id="0" w:name="_GoBack"/>
+      <w:bookmarkEnd w:id="0"/>
+    </w:p>
+    <w:p>
+      <w:pPr>
+        <w:jc w:val="center"/>
+        <w:rPr>
+          <w:lang w:val="ru-RU"/>
+        </w:rPr>
+      </w:pPr>
+    </w:p>
+    <w:p>
+      <w:pPr>
+        <w:rPr>
+          <w:lang w:val="ru-RU"/>
+        </w:rPr>
+      </w:pPr>
+      <w:r>
+        <w:rPr>
+          <w:lang w:val="ru-RU"/>
+        </w:rPr>
         <w:br w:type="page"/>
       </w:r>
     </w:p>
@@ -7666,8 +7702,6 @@
       <w:r>
         <w:t>Выводы</w:t>
       </w:r>
-      <w:bookmarkStart w:id="0" w:name="_GoBack"/>
-      <w:bookmarkEnd w:id="0"/>
       <w:proofErr w:type="spellEnd"/>
     </w:p>
     <w:p>
@@ -10793,7 +10827,7 @@
 </file>
 
 <file path=customXml/itemProps1.xml><?xml version="1.0" encoding="utf-8"?>
-<ds:datastoreItem xmlns:ds="http://schemas.openxmlformats.org/officeDocument/2006/customXml" ds:itemID="{B378972C-7132-411D-9F8D-A06F9AFC451B}">
+<ds:datastoreItem xmlns:ds="http://schemas.openxmlformats.org/officeDocument/2006/customXml" ds:itemID="{E1DF0181-470D-4480-BE8A-FC4CB3DD0C32}">
   <ds:schemaRefs>
     <ds:schemaRef ds:uri="http://schemas.openxmlformats.org/officeDocument/2006/bibliography"/>
   </ds:schemaRefs>

</xml_diff>